<commit_message>
Update Modelo Projeto Integrador_2025_2.docx
</commit_message>
<xml_diff>
--- a/Modelo Projeto Integrador_2025_2.docx
+++ b/Modelo Projeto Integrador_2025_2.docx
@@ -352,7 +352,25 @@
           <w:sz w:val="24"/>
           <w:szCs w:val="24"/>
         </w:rPr>
-        <w:t>Gustavo Gonçalves Rockembach – 202511601554</w:t>
+        <w:t xml:space="preserve">Gustavo Gonçalves </w:t>
+      </w:r>
+      <w:proofErr w:type="spellStart"/>
+      <w:r>
+        <w:rPr>
+          <w:color w:val="2E74B5" w:themeColor="accent1" w:themeShade="BF"/>
+          <w:sz w:val="24"/>
+          <w:szCs w:val="24"/>
+        </w:rPr>
+        <w:t>Rockembach</w:t>
+      </w:r>
+      <w:proofErr w:type="spellEnd"/>
+      <w:r>
+        <w:rPr>
+          <w:color w:val="2E74B5" w:themeColor="accent1" w:themeShade="BF"/>
+          <w:sz w:val="24"/>
+          <w:szCs w:val="24"/>
+        </w:rPr>
+        <w:t xml:space="preserve"> – 202511601554</w:t>
       </w:r>
     </w:p>
     <w:p>
@@ -371,7 +389,25 @@
           <w:sz w:val="24"/>
           <w:szCs w:val="24"/>
         </w:rPr>
-        <w:t>Paulo Ricardo Dalmaso – 202511601072</w:t>
+        <w:t xml:space="preserve">Paulo Ricardo </w:t>
+      </w:r>
+      <w:proofErr w:type="spellStart"/>
+      <w:r>
+        <w:rPr>
+          <w:color w:val="2E74B5" w:themeColor="accent1" w:themeShade="BF"/>
+          <w:sz w:val="24"/>
+          <w:szCs w:val="24"/>
+        </w:rPr>
+        <w:t>Dalmaso</w:t>
+      </w:r>
+      <w:proofErr w:type="spellEnd"/>
+      <w:r>
+        <w:rPr>
+          <w:color w:val="2E74B5" w:themeColor="accent1" w:themeShade="BF"/>
+          <w:sz w:val="24"/>
+          <w:szCs w:val="24"/>
+        </w:rPr>
+        <w:t xml:space="preserve"> – 202511601072</w:t>
       </w:r>
     </w:p>
     <w:p>
@@ -424,15 +460,6 @@
         </w:rPr>
         <w:br/>
       </w:r>
-    </w:p>
-    <w:p>
-      <w:pPr>
-        <w:pStyle w:val="Corpodetexto"/>
-        <w:rPr>
-          <w:sz w:val="24"/>
-          <w:szCs w:val="24"/>
-        </w:rPr>
-      </w:pPr>
     </w:p>
     <w:p>
       <w:pPr>
@@ -466,7 +493,6 @@
           <w:sz w:val="24"/>
           <w:szCs w:val="24"/>
         </w:rPr>
-        <w:lastRenderedPageBreak/>
         <w:t xml:space="preserve">Florianópolis, </w:t>
       </w:r>
       <w:r>
@@ -483,6 +509,7 @@
         </w:rPr>
         <w:t xml:space="preserve"> de </w:t>
       </w:r>
+      <w:proofErr w:type="gramStart"/>
       <w:r>
         <w:rPr>
           <w:sz w:val="24"/>
@@ -490,6 +517,7 @@
         </w:rPr>
         <w:t>Setembro</w:t>
       </w:r>
+      <w:proofErr w:type="gramEnd"/>
       <w:r>
         <w:rPr>
           <w:sz w:val="24"/>
@@ -511,26 +539,6 @@
         </w:rPr>
         <w:t>.</w:t>
       </w:r>
-    </w:p>
-    <w:p>
-      <w:pPr>
-        <w:pStyle w:val="Corpodetexto"/>
-        <w:jc w:val="center"/>
-        <w:rPr>
-          <w:sz w:val="24"/>
-          <w:szCs w:val="24"/>
-        </w:rPr>
-      </w:pPr>
-    </w:p>
-    <w:p>
-      <w:pPr>
-        <w:pStyle w:val="Corpodetexto"/>
-        <w:jc w:val="center"/>
-        <w:rPr>
-          <w:sz w:val="24"/>
-          <w:szCs w:val="24"/>
-        </w:rPr>
-      </w:pPr>
       <w:r>
         <w:rPr>
           <w:sz w:val="24"/>
@@ -1317,10 +1325,6 @@
             </w:rPr>
           </w:pPr>
           <w:r>
-            <w:rPr>
-              <w:sz w:val="24"/>
-              <w:szCs w:val="24"/>
-            </w:rPr>
             <w:fldChar w:fldCharType="begin"/>
           </w:r>
           <w:r>
@@ -2297,6 +2301,7 @@
       <w:pPr>
         <w:pStyle w:val="Ttulo1"/>
         <w:rPr>
+          <w:rFonts w:hint="eastAsia"/>
           <w:sz w:val="24"/>
           <w:szCs w:val="24"/>
         </w:rPr>
@@ -2390,21 +2395,7 @@
           <w:sz w:val="24"/>
           <w:szCs w:val="24"/>
         </w:rPr>
-        <w:t>Nossa aplicação está situada na área de esportes e lazer</w:t>
-      </w:r>
-      <w:r>
-        <w:rPr>
-          <w:sz w:val="24"/>
-          <w:szCs w:val="24"/>
-        </w:rPr>
-        <w:t xml:space="preserve">, </w:t>
-      </w:r>
-      <w:r>
-        <w:rPr>
-          <w:sz w:val="24"/>
-          <w:szCs w:val="24"/>
-        </w:rPr>
-        <w:t>enquadrando-se no setor de entretenimento e bem-estar social, onde promovemos a promoção da saúde física e o engajamento comunitário por meio de soluções digitais acessíveis.</w:t>
+        <w:t>Nossa aplicação está situada na área de esportes e lazer, enquadrando-se no setor de entretenimento e bem-estar social, onde promovemos a promoção da saúde física e o engajamento comunitário por meio de soluções digitais acessíveis.</w:t>
       </w:r>
       <w:r>
         <w:rPr>
@@ -2519,28 +2510,7 @@
           <w:sz w:val="24"/>
           <w:szCs w:val="24"/>
         </w:rPr>
-        <w:t xml:space="preserve">: A funcionalidade principal é a marcação de horários, onde o usuário pode visualizar quadras disponíveis, selecionar um </w:t>
-      </w:r>
-      <w:r>
-        <w:rPr>
-          <w:sz w:val="24"/>
-          <w:szCs w:val="24"/>
-        </w:rPr>
-        <w:t>horário</w:t>
-      </w:r>
-      <w:r>
-        <w:rPr>
-          <w:sz w:val="24"/>
-          <w:szCs w:val="24"/>
-        </w:rPr>
-        <w:t xml:space="preserve"> compatível com sua agenda, confirmar reservas</w:t>
-      </w:r>
-      <w:r>
-        <w:rPr>
-          <w:sz w:val="24"/>
-          <w:szCs w:val="24"/>
-        </w:rPr>
-        <w:t>.</w:t>
+        <w:t>: A funcionalidade principal é a marcação de horários, onde o usuário pode visualizar quadras disponíveis, selecionar um horário compatível com sua agenda, confirmar reservas.</w:t>
       </w:r>
     </w:p>
     <w:p>
@@ -2557,6 +2527,7 @@
       <w:pPr>
         <w:pStyle w:val="Ttulo2"/>
         <w:rPr>
+          <w:rFonts w:hint="eastAsia"/>
           <w:sz w:val="24"/>
           <w:szCs w:val="24"/>
         </w:rPr>
@@ -2986,7 +2957,25 @@
           <w:sz w:val="24"/>
           <w:szCs w:val="24"/>
         </w:rPr>
-        <w:t>A placa deve ser única no sistema e não deve ser permitida duplicações. Caso a placa já esteja cadastrada, o sistema deve exibir uma mensagem de erro indicando que a placa do veículo já encontra-se cadastrada.</w:t>
+        <w:t xml:space="preserve">A placa deve ser única no sistema e não deve ser permitida duplicações. Caso a placa já esteja cadastrada, o sistema deve exibir uma mensagem de erro indicando que a placa do veículo já </w:t>
+      </w:r>
+      <w:proofErr w:type="gramStart"/>
+      <w:r>
+        <w:rPr>
+          <w:color w:val="0B5394"/>
+          <w:sz w:val="24"/>
+          <w:szCs w:val="24"/>
+        </w:rPr>
+        <w:t>encontra-se</w:t>
+      </w:r>
+      <w:proofErr w:type="gramEnd"/>
+      <w:r>
+        <w:rPr>
+          <w:color w:val="0B5394"/>
+          <w:sz w:val="24"/>
+          <w:szCs w:val="24"/>
+        </w:rPr>
+        <w:t xml:space="preserve"> cadastrada.</w:t>
       </w:r>
     </w:p>
     <w:p>
@@ -3308,7 +3297,25 @@
           <w:sz w:val="24"/>
           <w:szCs w:val="24"/>
         </w:rPr>
-        <w:t>A funcionalidade Cadastrar veículo estará pronta quando todas as informações que o usuário inserir no cadastro forem salvas corretamente e ficarem disponíveis para consulta imediata.</w:t>
+        <w:t xml:space="preserve">A </w:t>
+      </w:r>
+      <w:proofErr w:type="gramStart"/>
+      <w:r>
+        <w:rPr>
+          <w:color w:val="0B5394"/>
+          <w:sz w:val="24"/>
+          <w:szCs w:val="24"/>
+        </w:rPr>
+        <w:t>funcionalidade Cadastrar</w:t>
+      </w:r>
+      <w:proofErr w:type="gramEnd"/>
+      <w:r>
+        <w:rPr>
+          <w:color w:val="0B5394"/>
+          <w:sz w:val="24"/>
+          <w:szCs w:val="24"/>
+        </w:rPr>
+        <w:t xml:space="preserve"> veículo estará pronta quando todas as informações que o usuário inserir no cadastro forem salvas corretamente e ficarem disponíveis para consulta imediata.</w:t>
       </w:r>
     </w:p>
     <w:p>
@@ -3336,7 +3343,43 @@
           <w:szCs w:val="24"/>
         </w:rPr>
         <w:lastRenderedPageBreak/>
-        <w:t>ATENÇÃO: Caros alunos, tudo o que estiver em “azul”  são apenas  exemplos para vocês realizarem a atividade e deve ser apagado.</w:t>
+        <w:t>ATENÇÃO: Caros alunos, tudo o que estiver em “</w:t>
+      </w:r>
+      <w:proofErr w:type="gramStart"/>
+      <w:r>
+        <w:rPr>
+          <w:color w:val="2A6099"/>
+          <w:sz w:val="24"/>
+          <w:szCs w:val="24"/>
+        </w:rPr>
+        <w:t>azul”  são</w:t>
+      </w:r>
+      <w:proofErr w:type="gramEnd"/>
+      <w:r>
+        <w:rPr>
+          <w:color w:val="2A6099"/>
+          <w:sz w:val="24"/>
+          <w:szCs w:val="24"/>
+        </w:rPr>
+        <w:t xml:space="preserve"> </w:t>
+      </w:r>
+      <w:proofErr w:type="gramStart"/>
+      <w:r>
+        <w:rPr>
+          <w:color w:val="2A6099"/>
+          <w:sz w:val="24"/>
+          <w:szCs w:val="24"/>
+        </w:rPr>
+        <w:t>apenas  exemplos</w:t>
+      </w:r>
+      <w:proofErr w:type="gramEnd"/>
+      <w:r>
+        <w:rPr>
+          <w:color w:val="2A6099"/>
+          <w:sz w:val="24"/>
+          <w:szCs w:val="24"/>
+        </w:rPr>
+        <w:t xml:space="preserve"> para vocês realizarem a atividade e deve ser apagado.</w:t>
       </w:r>
     </w:p>
     <w:p>
@@ -3481,6 +3524,7 @@
         </w:rPr>
         <w:t xml:space="preserve">Como </w:t>
       </w:r>
+      <w:proofErr w:type="spellStart"/>
       <w:r>
         <w:rPr>
           <w:b/>
@@ -3488,7 +3532,17 @@
           <w:sz w:val="24"/>
           <w:szCs w:val="24"/>
         </w:rPr>
-        <w:t>xxxxxx,</w:t>
+        <w:t>xxxxxx</w:t>
+      </w:r>
+      <w:proofErr w:type="spellEnd"/>
+      <w:r>
+        <w:rPr>
+          <w:b/>
+          <w:color w:val="2A6099"/>
+          <w:sz w:val="24"/>
+          <w:szCs w:val="24"/>
+        </w:rPr>
+        <w:t>,</w:t>
       </w:r>
       <w:r>
         <w:rPr>
@@ -3506,7 +3560,17 @@
           <w:sz w:val="24"/>
           <w:szCs w:val="24"/>
         </w:rPr>
-        <w:t xml:space="preserve"> xxxxxxxxxxxxx</w:t>
+        <w:t xml:space="preserve"> </w:t>
+      </w:r>
+      <w:proofErr w:type="spellStart"/>
+      <w:r>
+        <w:rPr>
+          <w:b/>
+          <w:color w:val="2A6099"/>
+          <w:sz w:val="24"/>
+          <w:szCs w:val="24"/>
+        </w:rPr>
+        <w:t>xxxxxxxxxxxxx</w:t>
       </w:r>
       <w:r>
         <w:rPr>
@@ -3515,7 +3579,17 @@
           <w:sz w:val="24"/>
           <w:szCs w:val="24"/>
         </w:rPr>
-        <w:t>para que</w:t>
+        <w:t>para</w:t>
+      </w:r>
+      <w:proofErr w:type="spellEnd"/>
+      <w:r>
+        <w:rPr>
+          <w:b/>
+          <w:color w:val="FF0000"/>
+          <w:sz w:val="24"/>
+          <w:szCs w:val="24"/>
+        </w:rPr>
+        <w:t xml:space="preserve"> que</w:t>
       </w:r>
       <w:r>
         <w:rPr>
@@ -3524,8 +3598,19 @@
           <w:sz w:val="24"/>
           <w:szCs w:val="24"/>
         </w:rPr>
-        <w:t xml:space="preserve"> xxxxxxxxxxxxxxxxxxxxx</w:t>
-      </w:r>
+        <w:t xml:space="preserve"> </w:t>
+      </w:r>
+      <w:proofErr w:type="spellStart"/>
+      <w:r>
+        <w:rPr>
+          <w:b/>
+          <w:color w:val="2A6099"/>
+          <w:sz w:val="24"/>
+          <w:szCs w:val="24"/>
+        </w:rPr>
+        <w:t>xxxxxxxxxxxxxxxxxxxxx</w:t>
+      </w:r>
+      <w:proofErr w:type="spellEnd"/>
     </w:p>
     <w:p>
       <w:pPr>
@@ -3538,6 +3623,7 @@
           <w:szCs w:val="24"/>
         </w:rPr>
       </w:pPr>
+      <w:proofErr w:type="spellStart"/>
       <w:r>
         <w:rPr>
           <w:b/>
@@ -3547,6 +3633,7 @@
         </w:rPr>
         <w:t>xxxxxxxxxxxxx</w:t>
       </w:r>
+      <w:proofErr w:type="spellEnd"/>
     </w:p>
     <w:p>
       <w:pPr>
@@ -3747,6 +3834,7 @@
         </w:rPr>
         <w:t xml:space="preserve">Como </w:t>
       </w:r>
+      <w:proofErr w:type="spellStart"/>
       <w:r>
         <w:rPr>
           <w:b/>
@@ -3754,7 +3842,17 @@
           <w:sz w:val="24"/>
           <w:szCs w:val="24"/>
         </w:rPr>
-        <w:t>xxxxxx,</w:t>
+        <w:t>xxxxxx</w:t>
+      </w:r>
+      <w:proofErr w:type="spellEnd"/>
+      <w:r>
+        <w:rPr>
+          <w:b/>
+          <w:color w:val="2A6099"/>
+          <w:sz w:val="24"/>
+          <w:szCs w:val="24"/>
+        </w:rPr>
+        <w:t>,</w:t>
       </w:r>
       <w:r>
         <w:rPr>
@@ -3772,7 +3870,17 @@
           <w:sz w:val="24"/>
           <w:szCs w:val="24"/>
         </w:rPr>
-        <w:t xml:space="preserve"> xxxxxxxxxxxxx</w:t>
+        <w:t xml:space="preserve"> </w:t>
+      </w:r>
+      <w:proofErr w:type="spellStart"/>
+      <w:r>
+        <w:rPr>
+          <w:b/>
+          <w:color w:val="2A6099"/>
+          <w:sz w:val="24"/>
+          <w:szCs w:val="24"/>
+        </w:rPr>
+        <w:t>xxxxxxxxxxxxx</w:t>
       </w:r>
       <w:r>
         <w:rPr>
@@ -3781,7 +3889,17 @@
           <w:sz w:val="24"/>
           <w:szCs w:val="24"/>
         </w:rPr>
-        <w:t>para que</w:t>
+        <w:t>para</w:t>
+      </w:r>
+      <w:proofErr w:type="spellEnd"/>
+      <w:r>
+        <w:rPr>
+          <w:b/>
+          <w:color w:val="FF0000"/>
+          <w:sz w:val="24"/>
+          <w:szCs w:val="24"/>
+        </w:rPr>
+        <w:t xml:space="preserve"> que</w:t>
       </w:r>
       <w:r>
         <w:rPr>
@@ -3790,8 +3908,19 @@
           <w:sz w:val="24"/>
           <w:szCs w:val="24"/>
         </w:rPr>
-        <w:t xml:space="preserve"> xxxxxxxxxxxxxxxxxxxxx</w:t>
-      </w:r>
+        <w:t xml:space="preserve"> </w:t>
+      </w:r>
+      <w:proofErr w:type="spellStart"/>
+      <w:r>
+        <w:rPr>
+          <w:b/>
+          <w:color w:val="2A6099"/>
+          <w:sz w:val="24"/>
+          <w:szCs w:val="24"/>
+        </w:rPr>
+        <w:t>xxxxxxxxxxxxxxxxxxxxx</w:t>
+      </w:r>
+      <w:proofErr w:type="spellEnd"/>
     </w:p>
     <w:p>
       <w:pPr>
@@ -3804,6 +3933,7 @@
           <w:szCs w:val="24"/>
         </w:rPr>
       </w:pPr>
+      <w:proofErr w:type="spellStart"/>
       <w:r>
         <w:rPr>
           <w:b/>
@@ -3813,6 +3943,7 @@
         </w:rPr>
         <w:t>xxxxxxxxxxxxx</w:t>
       </w:r>
+      <w:proofErr w:type="spellEnd"/>
     </w:p>
     <w:p>
       <w:pPr>
@@ -4011,6 +4142,7 @@
         </w:rPr>
         <w:t xml:space="preserve">Como </w:t>
       </w:r>
+      <w:proofErr w:type="spellStart"/>
       <w:r>
         <w:rPr>
           <w:b/>
@@ -4018,7 +4150,17 @@
           <w:sz w:val="24"/>
           <w:szCs w:val="24"/>
         </w:rPr>
-        <w:t>xxxxxx,</w:t>
+        <w:t>xxxxxx</w:t>
+      </w:r>
+      <w:proofErr w:type="spellEnd"/>
+      <w:r>
+        <w:rPr>
+          <w:b/>
+          <w:color w:val="2A6099"/>
+          <w:sz w:val="24"/>
+          <w:szCs w:val="24"/>
+        </w:rPr>
+        <w:t>,</w:t>
       </w:r>
       <w:r>
         <w:rPr>
@@ -4036,7 +4178,17 @@
           <w:sz w:val="24"/>
           <w:szCs w:val="24"/>
         </w:rPr>
-        <w:t xml:space="preserve"> xxxxxxxxxxxxx</w:t>
+        <w:t xml:space="preserve"> </w:t>
+      </w:r>
+      <w:proofErr w:type="spellStart"/>
+      <w:r>
+        <w:rPr>
+          <w:b/>
+          <w:color w:val="2A6099"/>
+          <w:sz w:val="24"/>
+          <w:szCs w:val="24"/>
+        </w:rPr>
+        <w:t>xxxxxxxxxxxxx</w:t>
       </w:r>
       <w:r>
         <w:rPr>
@@ -4045,7 +4197,17 @@
           <w:sz w:val="24"/>
           <w:szCs w:val="24"/>
         </w:rPr>
-        <w:t>para que</w:t>
+        <w:t>para</w:t>
+      </w:r>
+      <w:proofErr w:type="spellEnd"/>
+      <w:r>
+        <w:rPr>
+          <w:b/>
+          <w:color w:val="FF0000"/>
+          <w:sz w:val="24"/>
+          <w:szCs w:val="24"/>
+        </w:rPr>
+        <w:t xml:space="preserve"> que</w:t>
       </w:r>
       <w:r>
         <w:rPr>
@@ -4054,8 +4216,19 @@
           <w:sz w:val="24"/>
           <w:szCs w:val="24"/>
         </w:rPr>
-        <w:t xml:space="preserve"> xxxxxxxxxxxxxxxxxxxxx</w:t>
-      </w:r>
+        <w:t xml:space="preserve"> </w:t>
+      </w:r>
+      <w:proofErr w:type="spellStart"/>
+      <w:r>
+        <w:rPr>
+          <w:b/>
+          <w:color w:val="2A6099"/>
+          <w:sz w:val="24"/>
+          <w:szCs w:val="24"/>
+        </w:rPr>
+        <w:t>xxxxxxxxxxxxxxxxxxxxx</w:t>
+      </w:r>
+      <w:proofErr w:type="spellEnd"/>
     </w:p>
     <w:p>
       <w:pPr>
@@ -4068,6 +4241,7 @@
           <w:szCs w:val="24"/>
         </w:rPr>
       </w:pPr>
+      <w:proofErr w:type="spellStart"/>
       <w:r>
         <w:rPr>
           <w:b/>
@@ -4077,6 +4251,7 @@
         </w:rPr>
         <w:t>xxxxxxxxxxxxx</w:t>
       </w:r>
+      <w:proofErr w:type="spellEnd"/>
     </w:p>
     <w:p>
       <w:pPr>
@@ -4266,6 +4441,7 @@
         </w:rPr>
         <w:t xml:space="preserve">Como </w:t>
       </w:r>
+      <w:proofErr w:type="spellStart"/>
       <w:r>
         <w:rPr>
           <w:b/>
@@ -4273,7 +4449,17 @@
           <w:sz w:val="24"/>
           <w:szCs w:val="24"/>
         </w:rPr>
-        <w:t>xxxxxx,</w:t>
+        <w:t>xxxxxx</w:t>
+      </w:r>
+      <w:proofErr w:type="spellEnd"/>
+      <w:r>
+        <w:rPr>
+          <w:b/>
+          <w:color w:val="2A6099"/>
+          <w:sz w:val="24"/>
+          <w:szCs w:val="24"/>
+        </w:rPr>
+        <w:t>,</w:t>
       </w:r>
       <w:r>
         <w:rPr>
@@ -4291,7 +4477,17 @@
           <w:sz w:val="24"/>
           <w:szCs w:val="24"/>
         </w:rPr>
-        <w:t xml:space="preserve"> xxxxxxxxxxxxx</w:t>
+        <w:t xml:space="preserve"> </w:t>
+      </w:r>
+      <w:proofErr w:type="spellStart"/>
+      <w:r>
+        <w:rPr>
+          <w:b/>
+          <w:color w:val="2A6099"/>
+          <w:sz w:val="24"/>
+          <w:szCs w:val="24"/>
+        </w:rPr>
+        <w:t>xxxxxxxxxxxxx</w:t>
       </w:r>
       <w:r>
         <w:rPr>
@@ -4300,7 +4496,17 @@
           <w:sz w:val="24"/>
           <w:szCs w:val="24"/>
         </w:rPr>
-        <w:t>para que</w:t>
+        <w:t>para</w:t>
+      </w:r>
+      <w:proofErr w:type="spellEnd"/>
+      <w:r>
+        <w:rPr>
+          <w:b/>
+          <w:color w:val="FF0000"/>
+          <w:sz w:val="24"/>
+          <w:szCs w:val="24"/>
+        </w:rPr>
+        <w:t xml:space="preserve"> que</w:t>
       </w:r>
       <w:r>
         <w:rPr>
@@ -4309,8 +4515,19 @@
           <w:sz w:val="24"/>
           <w:szCs w:val="24"/>
         </w:rPr>
-        <w:t xml:space="preserve"> xxxxxxxxxxxxxxxxxxxxx</w:t>
-      </w:r>
+        <w:t xml:space="preserve"> </w:t>
+      </w:r>
+      <w:proofErr w:type="spellStart"/>
+      <w:r>
+        <w:rPr>
+          <w:b/>
+          <w:color w:val="2A6099"/>
+          <w:sz w:val="24"/>
+          <w:szCs w:val="24"/>
+        </w:rPr>
+        <w:t>xxxxxxxxxxxxxxxxxxxxx</w:t>
+      </w:r>
+      <w:proofErr w:type="spellEnd"/>
     </w:p>
     <w:p>
       <w:pPr>
@@ -4323,6 +4540,7 @@
           <w:szCs w:val="24"/>
         </w:rPr>
       </w:pPr>
+      <w:proofErr w:type="spellStart"/>
       <w:r>
         <w:rPr>
           <w:b/>
@@ -4332,6 +4550,7 @@
         </w:rPr>
         <w:t>xxxxxxxxxxxxx</w:t>
       </w:r>
+      <w:proofErr w:type="spellEnd"/>
     </w:p>
     <w:p>
       <w:pPr>
@@ -4522,6 +4741,7 @@
         </w:rPr>
         <w:t xml:space="preserve">Como </w:t>
       </w:r>
+      <w:proofErr w:type="spellStart"/>
       <w:r>
         <w:rPr>
           <w:b/>
@@ -4529,7 +4749,17 @@
           <w:sz w:val="24"/>
           <w:szCs w:val="24"/>
         </w:rPr>
-        <w:t>xxxxxx,</w:t>
+        <w:t>xxxxxx</w:t>
+      </w:r>
+      <w:proofErr w:type="spellEnd"/>
+      <w:r>
+        <w:rPr>
+          <w:b/>
+          <w:color w:val="2A6099"/>
+          <w:sz w:val="24"/>
+          <w:szCs w:val="24"/>
+        </w:rPr>
+        <w:t>,</w:t>
       </w:r>
       <w:r>
         <w:rPr>
@@ -4547,7 +4777,17 @@
           <w:sz w:val="24"/>
           <w:szCs w:val="24"/>
         </w:rPr>
-        <w:t xml:space="preserve"> xxxxxxxxxxxxx</w:t>
+        <w:t xml:space="preserve"> </w:t>
+      </w:r>
+      <w:proofErr w:type="spellStart"/>
+      <w:r>
+        <w:rPr>
+          <w:b/>
+          <w:color w:val="2A6099"/>
+          <w:sz w:val="24"/>
+          <w:szCs w:val="24"/>
+        </w:rPr>
+        <w:t>xxxxxxxxxxxxx</w:t>
       </w:r>
       <w:r>
         <w:rPr>
@@ -4556,7 +4796,17 @@
           <w:sz w:val="24"/>
           <w:szCs w:val="24"/>
         </w:rPr>
-        <w:t>para que</w:t>
+        <w:t>para</w:t>
+      </w:r>
+      <w:proofErr w:type="spellEnd"/>
+      <w:r>
+        <w:rPr>
+          <w:b/>
+          <w:color w:val="FF0000"/>
+          <w:sz w:val="24"/>
+          <w:szCs w:val="24"/>
+        </w:rPr>
+        <w:t xml:space="preserve"> que</w:t>
       </w:r>
       <w:r>
         <w:rPr>
@@ -4565,8 +4815,19 @@
           <w:sz w:val="24"/>
           <w:szCs w:val="24"/>
         </w:rPr>
-        <w:t xml:space="preserve"> xxxxxxxxxxxxxxxxxxxxx</w:t>
-      </w:r>
+        <w:t xml:space="preserve"> </w:t>
+      </w:r>
+      <w:proofErr w:type="spellStart"/>
+      <w:r>
+        <w:rPr>
+          <w:b/>
+          <w:color w:val="2A6099"/>
+          <w:sz w:val="24"/>
+          <w:szCs w:val="24"/>
+        </w:rPr>
+        <w:t>xxxxxxxxxxxxxxxxxxxxx</w:t>
+      </w:r>
+      <w:proofErr w:type="spellEnd"/>
     </w:p>
     <w:p>
       <w:pPr>
@@ -4579,6 +4840,7 @@
           <w:szCs w:val="24"/>
         </w:rPr>
       </w:pPr>
+      <w:proofErr w:type="spellStart"/>
       <w:r>
         <w:rPr>
           <w:b/>
@@ -4588,6 +4850,7 @@
         </w:rPr>
         <w:t>xxxxxxxxxxxxx</w:t>
       </w:r>
+      <w:proofErr w:type="spellEnd"/>
     </w:p>
     <w:p>
       <w:pPr>
@@ -6401,6 +6664,7 @@
   <w:style w:type="character" w:default="1" w:styleId="Fontepargpadro">
     <w:name w:val="Default Paragraph Font"/>
     <w:uiPriority w:val="1"/>
+    <w:semiHidden/>
     <w:unhideWhenUsed/>
   </w:style>
   <w:style w:type="table" w:default="1" w:styleId="Tabelanormal">

</xml_diff>